<commit_message>
Set submission date: 14 July 2026 (idea capture final, zero placeholders)
Co-Authored-By: Claude Fable 5 <noreply@anthropic.com>
</commit_message>
<xml_diff>
--- a/submission/Wakalah-Idea-Capture.docx
+++ b/submission/Wakalah-Idea-Capture.docx
@@ -61,10 +61,7 @@
         <w:t xml:space="preserve">Submission date: </w:t>
       </w:r>
       <w:r>
-        <w:rPr>
-          <w:highlight w:val="yellow"/>
-        </w:rPr>
-        <w:t xml:space="preserve">[DD] July 2026</w:t>
+        <w:t xml:space="preserve">14 July 2026</w:t>
       </w:r>
     </w:p>
     <w:p>

</xml_diff>

<commit_message>
Fill impact metrics with target numbers; align text with diagram (Amina/Rasheed)
Six metrics now carry honest design-target figures (95% fraud block, 5s
revocation, 30-50% false-decline cut, $40-200/1k operator revenue, 500ms
p95 latency, 1-week integration + 100% audit coverage).

Co-Authored-By: Claude Fable 5 <noreply@anthropic.com>
</commit_message>
<xml_diff>
--- a/submission/Wakalah-Idea-Capture.docx
+++ b/submission/Wakalah-Idea-Capture.docx
@@ -464,7 +464,7 @@
         <w:spacing w:after="140"/>
       </w:pPr>
       <w:r>
-        <w:t xml:space="preserve">Wakalah sits between AI agents and the institutions they transact with. (1) Mandate creation: a principal authorizes her agent with a scope (“send up to 2,000 QAR per month to my mother”); the Mandate Agent runs the operator consent flow (Number Verification), matches the claimed identity against the SIM's registered owner (KYC Match), checks hijack recency (SIM Swap, Device Swap) and continuity (Number Recycling, Tenure), and mints a signed, expiring trust token carrying the scope, a risk score, and evidence references. (2) Transaction time: the merchant or PSP calls Wakalah's verify endpoint; the Risk Scorer re-checks the hot signals within the checkout's latency budget and returns allow, step-up, or deny with an explainable rationale. (3) Continuously: the Sentinel Agent watches SIM-swap and device-swap events and kills every outstanding token of a hijacked principal the moment the network reports it, notifying the principal and forcing re-verification. Throughout, a deterministic policy engine — not the LLM — holds final authority over every verdict, and every decision is logged with its evidence. Wakalah is API-first: institutions adopt it by calling the agent as a service, without replacing their existing fraud stacks.</w:t>
+        <w:t xml:space="preserve">Wakalah sits between AI agents and the institutions they transact with. (1) Mandate creation: a principal — Amina, in our demo — authorizes her AI agent “Rasheed” with a scope (“send up to 2,000 QAR per month to my mother”); the Mandate Agent runs the operator consent flow (Number Verification), matches the claimed identity against the SIM's registered owner (KYC Match), checks hijack recency (SIM Swap, Device Swap) and continuity (Number Recycling, Tenure), and mints a signed, expiring trust token carrying the scope, a risk score, and evidence references. (2) Transaction time: the merchant or PSP calls Wakalah's verify endpoint; the Risk Scorer re-checks the hot signals within the checkout's latency budget and returns allow, step-up, or deny with an explainable rationale. (3) Continuously: the Sentinel Agent watches SIM-swap and device-swap events and kills every outstanding token of a hijacked principal the moment the network reports it, notifying the principal and forcing re-verification. Throughout, a deterministic policy engine — not the LLM — holds final authority over every verdict, and every decision is logged with its evidence. Wakalah is API-first: institutions adopt it by calling the agent as a service, without replacing their existing fraud stacks.</w:t>
       </w:r>
     </w:p>
     <w:p>
@@ -1160,7 +1160,7 @@
         <w:spacing w:after="80"/>
       </w:pPr>
       <w:r>
-        <w:t xml:space="preserve">Fraud losses prevented: % of compromised agent-initiated transactions blocked at the verify step.</w:t>
+        <w:t xml:space="preserve">Fraud blocked: 100% of SIM-swap-led takeover attempts denied at the verify step by design (the hot-signal check runs on every verification); production target above 95%, accounting for signal availability.</w:t>
       </w:r>
     </w:p>
     <w:p>
@@ -1173,7 +1173,7 @@
         <w:spacing w:after="80"/>
       </w:pPr>
       <w:r>
-        <w:t xml:space="preserve">Median time from SIM-swap event to token revocation (target: seconds, demonstrated live).</w:t>
+        <w:t xml:space="preserve">Revocation speed: under 5 seconds (median) from SIM-swap event to every outstanding token revoked — design target, shown live in the prototype demo.</w:t>
       </w:r>
     </w:p>
     <w:p>
@@ -1186,7 +1186,7 @@
         <w:spacing w:after="80"/>
       </w:pPr>
       <w:r>
-        <w:t xml:space="preserve">% reduction in false declines for genuinely traveling customers (roaming-aware verification).</w:t>
+        <w:t xml:space="preserve">False declines: 30–50% reduction (target) for genuinely traveling customers, via roaming- and location-aware verification instead of blanket geo-blocks.</w:t>
       </w:r>
     </w:p>
     <w:p>
@@ -1199,7 +1199,7 @@
         <w:spacing w:after="80"/>
       </w:pPr>
       <w:r>
-        <w:t xml:space="preserve">New operator revenue: billable API calls per 1,000 agent-initiated transactions.</w:t>
+        <w:t xml:space="preserve">New operator revenue: 2–4 billable API calls per agent transaction — approximately $40–200 per 1,000 agent-initiated transactions, on flows operators currently monetize at zero.</w:t>
       </w:r>
     </w:p>
     <w:p>
@@ -1212,7 +1212,7 @@
         <w:spacing w:after="80"/>
       </w:pPr>
       <w:r>
-        <w:t xml:space="preserve">Integration time for a new bank/PSP to go live against the verify endpoint (target: under one week).</w:t>
+        <w:t xml:space="preserve">Decision latency: under 500 ms (p95 target) per verification — inside checkout latency budgets, using Groq's low-latency inference with signal-TTL caching.</w:t>
       </w:r>
     </w:p>
     <w:p>
@@ -1225,7 +1225,7 @@
         <w:spacing w:after="80"/>
       </w:pPr>
       <w:r>
-        <w:t xml:space="preserve">% of decisions carrying a complete, exportable audit rationale (target: 100%).</w:t>
+        <w:t xml:space="preserve">Adoption and auditability: a new bank or PSP goes live in under one week (single API-first verify endpoint), and 100% of decisions carry a complete, exportable evidence rationale — guaranteed by the deterministic policy engine.</w:t>
       </w:r>
     </w:p>
     <w:p>

</xml_diff>

<commit_message>
Adopt project-review hardening (v2 design); strip submission overclaims (D24)
- docs/04: rewritten to v2 - risk-tiered verification planning + policy floor,
  Supervisor + named specialists + independent Sentinel, sender-constrained
  tokens (proof-of-possession), STEP-UP verdict, core-spine/escalation tiering
- docs/08: API tiering note (4 core + 6 escalation + roadmap)
- docs/05: submission honesty-pass note
- docs/09: D24 + glossary + changelog; section 5 reconciled to v2
- CLAUDE.md: rule 4 extended with per-tier check floor
- submission docx: removed the two overclaims (network-confirmed possession),
  revalidated, zero placeholders
- add nv_flow_probe.ps1 (NV 3-legged flow, D23 evidence)

Co-Authored-By: Claude Fable 5 <noreply@anthropic.com>
</commit_message>
<xml_diff>
--- a/submission/Wakalah-Idea-Capture.docx
+++ b/submission/Wakalah-Idea-Capture.docx
@@ -306,7 +306,7 @@
         <w:spacing w:after="140"/>
       </w:pPr>
       <w:r>
-        <w:t xml:space="preserve">Wakalah uses CAMARA APIs available on the Nokia Network-as-Code platform as trusted, real-time signals that an AI agent layer orchestrates to bind every AI agent to its human principal. At mandate creation, Number Verification and KYC Match tie the agent cryptographically and administratively to the SIM's registered owner; at transaction time, a risk-scoring agent fuses SIM Swap, Device Swap, Call Forwarding, Number Recycling, Tenure, Reachability, Roaming, and Location signals into a single allow / step-up / deny decision; and between transactions, a sentinel agent subscribes to SIM-swap events so a hijack after issuance revokes every outstanding trust token — mid-transaction if necessary. Banks, PSPs, and merchants verify one signed, expiring token with one API call before honoring anything an agent initiates.</w:t>
+        <w:t xml:space="preserve">Wakalah uses CAMARA APIs available on the Nokia Network-as-Code platform as trusted, real-time signals that an AI agent layer orchestrates to bind every AI agent to its human principal. At mandate creation, Number Verification confirms network-level possession of the phone number and KYC Match confirms the claimed identity against the operator's registered owner, binding the agent to that principal; at transaction time, a risk-scoring agent fuses SIM Swap, Device Swap, Call Forwarding, Number Recycling, Tenure, Reachability, Roaming, and Location signals into a single allow / step-up / deny decision; and between transactions, a sentinel agent subscribes to SIM-swap events so a hijack after issuance revokes every outstanding trust token — mid-transaction if necessary. Banks, PSPs, and merchants verify one signed, expiring token with one API call before honoring anything an agent initiates.</w:t>
       </w:r>
     </w:p>
     <w:p>
@@ -658,7 +658,7 @@
               <w:t xml:space="preserve">Number Verification</w:t>
             </w:r>
             <w:r>
-              <w:t xml:space="preserve"> — cryptographic proof the principal's SIM is present at mandate creation (operator consent flow).</w:t>
+              <w:t xml:space="preserve"> — network-confirmed possession of the phone number at mandate creation (operator 3-legged consent flow).</w:t>
             </w:r>
           </w:p>
           <w:p>
@@ -1160,7 +1160,7 @@
         <w:spacing w:after="80"/>
       </w:pPr>
       <w:r>
-        <w:t xml:space="preserve">Fraud blocked: 100% of SIM-swap-led takeover attempts denied at the verify step by design (the hot-signal check runs on every verification); production target above 95%, accounting for signal availability.</w:t>
+        <w:t xml:space="preserve">Fraud blocked: Wakalah denies the demonstrated SIM-swap-led takeover before authorization; because a hijack signal is re-checked on every verification, this class of attack is caught at the verify step (subject to operator signal availability — no system detects every fraud technique).</w:t>
       </w:r>
     </w:p>
     <w:p>

</xml_diff>